<commit_message>
Complete Daily Brief foundational papers and Knowledge
</commit_message>
<xml_diff>
--- a/public/knowledge/alpha-compositing-one-pager.docx
+++ b/public/knowledge/alpha-compositing-one-pager.docx
@@ -4,7 +4,7 @@
   <w:body>
     <w:p>
       <w:pPr>
-        <w:spacing w:before="0" w:after="80" w:line="252" w:lineRule="auto"/>
+        <w:spacing w:before="0" w:after="60" w:line="240" w:lineRule="auto"/>
       </w:pPr>
       <w:r>
         <w:rPr>
@@ -32,35 +32,7 @@
     </w:p>
     <w:p>
       <w:pPr>
-        <w:spacing w:before="0" w:after="160" w:line="252" w:lineRule="auto"/>
-      </w:pPr>
-      <w:r>
-        <w:rPr>
-          <w:rFonts w:ascii="Noto Sans KR" w:hAnsi="Noto Sans KR" w:eastAsia="Noto Sans KR"/>
-          <w:b w:val="0"/>
-          <w:color w:val="48545E"/>
-          <w:sz w:val="18"/>
-        </w:rPr>
-        <w:t>투명도와 레이어가 최종 이미지를 만드는 방식</w:t>
-      </w:r>
-    </w:p>
-    <w:p>
-      <w:pPr>
-        <w:spacing w:before="0" w:after="20" w:line="252" w:lineRule="auto"/>
-      </w:pPr>
-      <w:r>
-        <w:rPr>
-          <w:rFonts w:ascii="Noto Sans KR" w:hAnsi="Noto Sans KR" w:eastAsia="Noto Sans KR"/>
-          <w:b/>
-          <w:color w:val="111820"/>
-          <w:sz w:val="18"/>
-        </w:rPr>
-        <w:t>01. 한 줄 정의</w:t>
-      </w:r>
-    </w:p>
-    <w:p>
-      <w:pPr>
-        <w:spacing w:before="0" w:after="80" w:line="252" w:lineRule="auto"/>
+        <w:spacing w:before="0" w:after="100" w:line="240" w:lineRule="auto"/>
       </w:pPr>
       <w:r>
         <w:rPr>
@@ -69,12 +41,12 @@
           <w:color w:val="48545E"/>
           <w:sz w:val="17"/>
         </w:rPr>
-        <w:t>Alpha 합성은 앞 이미지의 투명도(Alpha)를 기준으로 앞·뒤 픽셀의 색을 섞어 한 화면으로 만드는 계산입니다.</w:t>
+        <w:t>투명도와 레이어가 최종 이미지를 만드는 방식</w:t>
       </w:r>
     </w:p>
     <w:p>
       <w:pPr>
-        <w:spacing w:before="40" w:after="20" w:line="252" w:lineRule="auto"/>
+        <w:spacing w:before="0" w:after="20" w:line="240" w:lineRule="auto"/>
       </w:pPr>
       <w:r>
         <w:rPr>
@@ -83,12 +55,12 @@
           <w:color w:val="111820"/>
           <w:sz w:val="17"/>
         </w:rPr>
-        <w:t>02. 왜 알아야 하는가</w:t>
+        <w:t>01. 한 줄 정의</w:t>
       </w:r>
     </w:p>
     <w:p>
       <w:pPr>
-        <w:spacing w:before="0" w:after="60" w:line="245" w:lineRule="auto"/>
+        <w:spacing w:before="0" w:after="80" w:line="240" w:lineRule="auto"/>
       </w:pPr>
       <w:r>
         <w:rPr>
@@ -97,35 +69,7 @@
           <w:color w:val="48545E"/>
           <w:sz w:val="16"/>
         </w:rPr>
-        <w:t>AI 이미지 편집에서 결과를 RGBA 레이어로 나누어도, 다시 합쳤을 때 의도한 화면이 나오지 않으면 재사용성이 낮습니다. LayerEditor는 편집 이미지와 레이어를 함께 예측하므로 합성 결과를 별도로 확인해야 합니다.</w:t>
-      </w:r>
-    </w:p>
-    <w:p>
-      <w:pPr>
-        <w:spacing w:before="40" w:after="20" w:line="252" w:lineRule="auto"/>
-      </w:pPr>
-      <w:r>
-        <w:rPr>
-          <w:rFonts w:ascii="Noto Sans KR" w:hAnsi="Noto Sans KR" w:eastAsia="Noto Sans KR"/>
-          <w:b/>
-          <w:color w:val="111820"/>
-          <w:sz w:val="17"/>
-        </w:rPr>
-        <w:t>03. 쉬운 비유와 작동 원리</w:t>
-      </w:r>
-    </w:p>
-    <w:p>
-      <w:pPr>
-        <w:spacing w:before="0" w:after="60" w:line="245" w:lineRule="auto"/>
-      </w:pPr>
-      <w:r>
-        <w:rPr>
-          <w:rFonts w:ascii="Noto Sans KR" w:hAnsi="Noto Sans KR" w:eastAsia="Noto Sans KR"/>
-          <w:b w:val="0"/>
-          <w:color w:val="48545E"/>
-          <w:sz w:val="16"/>
-        </w:rPr>
-        <w:t>투명 필름을 그림 위에 겹치는 것과 비슷합니다. Alpha 1은 완전히 불투명, 0은 완전히 투명, 그 사이는 일부가 비치는 상태입니다. 불투명한 배경에서는 결과 색 = Alpha × 앞색 + (1 − Alpha) × 배경색으로 계산합니다.</w:t>
+        <w:t>Alpha 합성은 앞 이미지의 투명도(Alpha)를 기준으로 앞·뒤 픽셀의 색을 섞어 한 화면으로 만드는 계산입니다.</w:t>
       </w:r>
     </w:p>
     <w:tbl>
@@ -143,22 +87,24 @@
         </w:tblBorders>
       </w:tblPr>
       <w:tblGrid>
-        <w:gridCol w:w="2098"/>
-        <w:gridCol w:w="2098"/>
-        <w:gridCol w:w="2098"/>
-        <w:gridCol w:w="2098"/>
-        <w:gridCol w:w="2098"/>
+        <w:gridCol w:w="1515"/>
+        <w:gridCol w:w="1515"/>
+        <w:gridCol w:w="1515"/>
+        <w:gridCol w:w="1515"/>
+        <w:gridCol w:w="1515"/>
+        <w:gridCol w:w="1515"/>
+        <w:gridCol w:w="1515"/>
       </w:tblGrid>
       <w:tr>
         <w:tc>
           <w:tcPr>
-            <w:tcW w:type="dxa" w:w="3175"/>
+            <w:tcW w:type="dxa" w:w="2331"/>
             <w:vAlign w:val="center"/>
             <w:shd w:fill="F0E0E3"/>
           </w:tcPr>
           <w:p>
             <w:pPr>
-              <w:spacing w:after="0" w:line="240" w:lineRule="auto"/>
+              <w:spacing w:after="0" w:line="228" w:lineRule="auto"/>
               <w:jc w:val="center"/>
             </w:pPr>
             <w:r>
@@ -166,11 +112,9 @@
                 <w:rFonts w:ascii="Noto Sans KR" w:hAnsi="Noto Sans KR" w:eastAsia="Noto Sans KR"/>
                 <w:b w:val="0"/>
                 <w:color w:val="111820"/>
-                <w:sz w:val="14"/>
+                <w:sz w:val="13"/>
               </w:rPr>
               <w:t>전경 레이어</w:t>
-              <w:br/>
-              <w:t>Alpha 55%</w:t>
             </w:r>
           </w:p>
         </w:tc>
@@ -178,11 +122,10 @@
           <w:tcPr>
             <w:tcW w:type="dxa" w:w="369"/>
             <w:vAlign w:val="center"/>
-            <w:shd w:fill="FFFFFF"/>
           </w:tcPr>
           <w:p>
             <w:pPr>
-              <w:spacing w:after="0" w:line="240" w:lineRule="auto"/>
+              <w:spacing w:after="0" w:line="228" w:lineRule="auto"/>
               <w:jc w:val="center"/>
             </w:pPr>
             <w:r>
@@ -190,21 +133,21 @@
                 <w:rFonts w:ascii="Noto Sans KR" w:hAnsi="Noto Sans KR" w:eastAsia="Noto Sans KR"/>
                 <w:b/>
                 <w:color w:val="111820"/>
-                <w:sz w:val="14"/>
+                <w:sz w:val="13"/>
               </w:rPr>
-              <w:t>+</w:t>
+              <w:t>→</w:t>
             </w:r>
           </w:p>
         </w:tc>
         <w:tc>
           <w:tcPr>
-            <w:tcW w:type="dxa" w:w="2665"/>
+            <w:tcW w:type="dxa" w:w="2331"/>
             <w:vAlign w:val="center"/>
             <w:shd w:fill="DCE6EC"/>
           </w:tcPr>
           <w:p>
             <w:pPr>
-              <w:spacing w:after="0" w:line="240" w:lineRule="auto"/>
+              <w:spacing w:after="0" w:line="228" w:lineRule="auto"/>
               <w:jc w:val="center"/>
             </w:pPr>
             <w:r>
@@ -212,11 +155,9 @@
                 <w:rFonts w:ascii="Noto Sans KR" w:hAnsi="Noto Sans KR" w:eastAsia="Noto Sans KR"/>
                 <w:b w:val="0"/>
                 <w:color w:val="111820"/>
-                <w:sz w:val="14"/>
+                <w:sz w:val="13"/>
               </w:rPr>
-              <w:t>불투명한 배경</w:t>
-              <w:br/>
-              <w:t>Alpha 100%</w:t>
+              <w:t>Alpha 계산</w:t>
             </w:r>
           </w:p>
         </w:tc>
@@ -224,11 +165,10 @@
           <w:tcPr>
             <w:tcW w:type="dxa" w:w="369"/>
             <w:vAlign w:val="center"/>
-            <w:shd w:fill="FFFFFF"/>
           </w:tcPr>
           <w:p>
             <w:pPr>
-              <w:spacing w:after="0" w:line="240" w:lineRule="auto"/>
+              <w:spacing w:after="0" w:line="228" w:lineRule="auto"/>
               <w:jc w:val="center"/>
             </w:pPr>
             <w:r>
@@ -236,7 +176,7 @@
                 <w:rFonts w:ascii="Noto Sans KR" w:hAnsi="Noto Sans KR" w:eastAsia="Noto Sans KR"/>
                 <w:b/>
                 <w:color w:val="111820"/>
-                <w:sz w:val="14"/>
+                <w:sz w:val="13"/>
               </w:rPr>
               <w:t>→</w:t>
             </w:r>
@@ -244,13 +184,13 @@
         </w:tc>
         <w:tc>
           <w:tcPr>
-            <w:tcW w:type="dxa" w:w="2835"/>
+            <w:tcW w:type="dxa" w:w="2331"/>
             <w:vAlign w:val="center"/>
             <w:shd w:fill="D9E6DF"/>
           </w:tcPr>
           <w:p>
             <w:pPr>
-              <w:spacing w:after="0" w:line="240" w:lineRule="auto"/>
+              <w:spacing w:after="0" w:line="228" w:lineRule="auto"/>
               <w:jc w:val="center"/>
             </w:pPr>
             <w:r>
@@ -258,9 +198,52 @@
                 <w:rFonts w:ascii="Noto Sans KR" w:hAnsi="Noto Sans KR" w:eastAsia="Noto Sans KR"/>
                 <w:b w:val="0"/>
                 <w:color w:val="111820"/>
-                <w:sz w:val="14"/>
+                <w:sz w:val="13"/>
               </w:rPr>
-              <w:t>합성된 화면</w:t>
+              <w:t>배경 결합</w:t>
+            </w:r>
+          </w:p>
+        </w:tc>
+        <w:tc>
+          <w:tcPr>
+            <w:tcW w:type="dxa" w:w="369"/>
+            <w:vAlign w:val="center"/>
+          </w:tcPr>
+          <w:p>
+            <w:pPr>
+              <w:spacing w:after="0" w:line="228" w:lineRule="auto"/>
+              <w:jc w:val="center"/>
+            </w:pPr>
+            <w:r>
+              <w:rPr>
+                <w:rFonts w:ascii="Noto Sans KR" w:hAnsi="Noto Sans KR" w:eastAsia="Noto Sans KR"/>
+                <w:b/>
+                <w:color w:val="111820"/>
+                <w:sz w:val="13"/>
+              </w:rPr>
+              <w:t>→</w:t>
+            </w:r>
+          </w:p>
+        </w:tc>
+        <w:tc>
+          <w:tcPr>
+            <w:tcW w:type="dxa" w:w="2331"/>
+            <w:vAlign w:val="center"/>
+            <w:shd w:fill="EEE7D7"/>
+          </w:tcPr>
+          <w:p>
+            <w:pPr>
+              <w:spacing w:after="0" w:line="228" w:lineRule="auto"/>
+              <w:jc w:val="center"/>
+            </w:pPr>
+            <w:r>
+              <w:rPr>
+                <w:rFonts w:ascii="Noto Sans KR" w:hAnsi="Noto Sans KR" w:eastAsia="Noto Sans KR"/>
+                <w:b w:val="0"/>
+                <w:color w:val="111820"/>
+                <w:sz w:val="13"/>
+              </w:rPr>
+              <w:t>합성 화면</w:t>
             </w:r>
           </w:p>
         </w:tc>
@@ -268,7 +251,34 @@
     </w:tbl>
     <w:p>
       <w:pPr>
-        <w:spacing w:before="60" w:after="80" w:line="252" w:lineRule="auto"/>
+        <w:spacing w:before="0" w:after="40" w:line="240" w:lineRule="auto"/>
+      </w:pPr>
+      <w:r>
+        <w:rPr>
+          <w:rFonts w:ascii="Noto Sans KR" w:hAnsi="Noto Sans KR" w:eastAsia="Noto Sans KR"/>
+          <w:b w:val="0"/>
+          <w:color w:val="48545E"/>
+          <w:sz w:val="2"/>
+        </w:rPr>
+      </w:r>
+    </w:p>
+    <w:p>
+      <w:pPr>
+        <w:spacing w:before="20" w:after="10" w:line="240" w:lineRule="auto"/>
+      </w:pPr>
+      <w:r>
+        <w:rPr>
+          <w:rFonts w:ascii="Noto Sans KR" w:hAnsi="Noto Sans KR" w:eastAsia="Noto Sans KR"/>
+          <w:b/>
+          <w:color w:val="111820"/>
+          <w:sz w:val="17"/>
+        </w:rPr>
+        <w:t>02. 왜 알아야 하는가</w:t>
+      </w:r>
+    </w:p>
+    <w:p>
+      <w:pPr>
+        <w:spacing w:before="0" w:after="40" w:line="240" w:lineRule="auto"/>
       </w:pPr>
       <w:r>
         <w:rPr>
@@ -277,12 +287,40 @@
           <w:color w:val="48545E"/>
           <w:sz w:val="15"/>
         </w:rPr>
-        <w:t>불투명 배경: 결과색 = Alpha × 앞색 + (1 − Alpha) × 배경색</w:t>
+        <w:t>AI 이미지 편집에서 결과를 RGBA 레이어로 나누어도, 다시 합쳤을 때 의도한 화면이 나오지 않으면 재사용성이 낮습니다. LayerEditor는 편집 이미지와 레이어를 함께 예측하므로 합성 결과를 별도로 확인해야 합니다.</w:t>
       </w:r>
     </w:p>
     <w:p>
       <w:pPr>
-        <w:spacing w:before="40" w:after="20" w:line="252" w:lineRule="auto"/>
+        <w:spacing w:before="20" w:after="10" w:line="240" w:lineRule="auto"/>
+      </w:pPr>
+      <w:r>
+        <w:rPr>
+          <w:rFonts w:ascii="Noto Sans KR" w:hAnsi="Noto Sans KR" w:eastAsia="Noto Sans KR"/>
+          <w:b/>
+          <w:color w:val="111820"/>
+          <w:sz w:val="17"/>
+        </w:rPr>
+        <w:t>03. 쉬운 비유와 작동 원리</w:t>
+      </w:r>
+    </w:p>
+    <w:p>
+      <w:pPr>
+        <w:spacing w:before="0" w:after="40" w:line="240" w:lineRule="auto"/>
+      </w:pPr>
+      <w:r>
+        <w:rPr>
+          <w:rFonts w:ascii="Noto Sans KR" w:hAnsi="Noto Sans KR" w:eastAsia="Noto Sans KR"/>
+          <w:b w:val="0"/>
+          <w:color w:val="48545E"/>
+          <w:sz w:val="15"/>
+        </w:rPr>
+        <w:t>투명 필름을 그림 위에 겹치는 것과 비슷합니다. Alpha 1은 완전히 불투명, 0은 완전히 투명, 그 사이는 일부가 비치는 상태입니다. 불투명한 배경에서는 결과 색 = Alpha × 앞색 + (1 − Alpha) × 배경색으로 계산합니다.</w:t>
+      </w:r>
+    </w:p>
+    <w:p>
+      <w:pPr>
+        <w:spacing w:before="20" w:after="10" w:line="240" w:lineRule="auto"/>
       </w:pPr>
       <w:r>
         <w:rPr>
@@ -296,21 +334,21 @@
     </w:p>
     <w:p>
       <w:pPr>
-        <w:spacing w:before="0" w:after="60" w:line="245" w:lineRule="auto"/>
+        <w:spacing w:before="0" w:after="40" w:line="240" w:lineRule="auto"/>
       </w:pPr>
       <w:r>
         <w:rPr>
           <w:rFonts w:ascii="Noto Sans KR" w:hAnsi="Noto Sans KR" w:eastAsia="Noto Sans KR"/>
           <w:b w:val="0"/>
           <w:color w:val="48545E"/>
-          <w:sz w:val="16"/>
+          <w:sz w:val="15"/>
         </w:rPr>
         <w:t>투명 PNG, 웹 화면의 오버레이, 영상 효과, 여러 레이어로 구성한 포스터를 한 화면에 표시할 때 사용합니다. 브라우저 Canvas 2D는 source-over를 기본 합성 방식으로 둡니다.</w:t>
       </w:r>
     </w:p>
     <w:p>
       <w:pPr>
-        <w:spacing w:before="40" w:after="20" w:line="252" w:lineRule="auto"/>
+        <w:spacing w:before="20" w:after="10" w:line="240" w:lineRule="auto"/>
       </w:pPr>
       <w:r>
         <w:rPr>
@@ -324,21 +362,21 @@
     </w:p>
     <w:p>
       <w:pPr>
-        <w:spacing w:before="0" w:after="60" w:line="245" w:lineRule="auto"/>
+        <w:spacing w:before="0" w:after="40" w:line="240" w:lineRule="auto"/>
       </w:pPr>
       <w:r>
         <w:rPr>
           <w:rFonts w:ascii="Noto Sans KR" w:hAnsi="Noto Sans KR" w:eastAsia="Noto Sans KR"/>
           <w:b w:val="0"/>
           <w:color w:val="48545E"/>
-          <w:sz w:val="16"/>
+          <w:sz w:val="15"/>
         </w:rPr>
         <w:t>합성은 앞·뒤 이미지의 기여율을 결합합니다. 블렌딩은 multiply처럼 겹치는 색의 상호작용을 정합니다. 분할·매팅은 합성 전에 객체 픽셀이나 경계의 투명도를 찾아냅니다.</w:t>
       </w:r>
     </w:p>
     <w:p>
       <w:pPr>
-        <w:spacing w:before="40" w:after="20" w:line="252" w:lineRule="auto"/>
+        <w:spacing w:before="20" w:after="10" w:line="240" w:lineRule="auto"/>
       </w:pPr>
       <w:r>
         <w:rPr>
@@ -352,21 +390,21 @@
     </w:p>
     <w:p>
       <w:pPr>
-        <w:spacing w:before="0" w:after="60" w:line="245" w:lineRule="auto"/>
+        <w:spacing w:before="0" w:after="40" w:line="240" w:lineRule="auto"/>
       </w:pPr>
       <w:r>
         <w:rPr>
           <w:rFonts w:ascii="Noto Sans KR" w:hAnsi="Noto Sans KR" w:eastAsia="Noto Sans KR"/>
           <w:b w:val="0"/>
           <w:color w:val="48545E"/>
-          <w:sz w:val="16"/>
+          <w:sz w:val="15"/>
         </w:rPr>
         <w:t>인재·조직 의사결정에 직접 적용되는 개념은 아닙니다. 다만 사내 포스터나 채용 콘텐츠를 레이어 단위로 수정할 때, AI가 만든 RGBA 레이어가 텍스트 편집과 경계 보존까지 보장하지는 않으므로 재사용 전에 확인해야 합니다.</w:t>
       </w:r>
     </w:p>
     <w:p>
       <w:pPr>
-        <w:spacing w:before="40" w:after="20" w:line="252" w:lineRule="auto"/>
+        <w:spacing w:before="20" w:after="10" w:line="240" w:lineRule="auto"/>
       </w:pPr>
       <w:r>
         <w:rPr>
@@ -380,21 +418,21 @@
     </w:p>
     <w:p>
       <w:pPr>
-        <w:spacing w:before="0" w:after="60" w:line="245" w:lineRule="auto"/>
+        <w:spacing w:before="0" w:after="40" w:line="240" w:lineRule="auto"/>
       </w:pPr>
       <w:r>
         <w:rPr>
           <w:rFonts w:ascii="Noto Sans KR" w:hAnsi="Noto Sans KR" w:eastAsia="Noto Sans KR"/>
           <w:b w:val="0"/>
           <w:color w:val="48545E"/>
-          <w:sz w:val="16"/>
+          <w:sz w:val="15"/>
         </w:rPr>
         <w:t>레이어를 나누는 것만으로 편집성이 보장되지는 않습니다. 다시 합친 결과의 충실도와, 각 레이어를 바꾼 뒤에도 다른 내용이 유지되는지를 함께 확인하세요.</w:t>
       </w:r>
     </w:p>
     <w:p>
       <w:pPr>
-        <w:spacing w:before="40" w:after="20" w:line="252" w:lineRule="auto"/>
+        <w:spacing w:before="40" w:after="20" w:line="240" w:lineRule="auto"/>
       </w:pPr>
       <w:r>
         <w:rPr>
@@ -408,7 +446,7 @@
     </w:p>
     <w:p>
       <w:pPr>
-        <w:spacing w:before="0" w:after="20" w:line="240" w:lineRule="auto"/>
+        <w:spacing w:before="0" w:after="0" w:line="240" w:lineRule="auto"/>
       </w:pPr>
       <w:r>
         <w:rPr>
@@ -422,7 +460,7 @@
     </w:p>
     <w:p>
       <w:pPr>
-        <w:spacing w:before="0" w:after="20" w:line="240" w:lineRule="auto"/>
+        <w:spacing w:before="0" w:after="0" w:line="240" w:lineRule="auto"/>
       </w:pPr>
       <w:r>
         <w:rPr>
@@ -436,7 +474,7 @@
     </w:p>
     <w:p>
       <w:pPr>
-        <w:spacing w:before="0" w:after="20" w:line="240" w:lineRule="auto"/>
+        <w:spacing w:before="0" w:after="0" w:line="240" w:lineRule="auto"/>
       </w:pPr>
       <w:r>
         <w:rPr>
@@ -450,7 +488,7 @@
     </w:p>
     <w:sectPr>
       <w:pgSz w:w="11906" w:h="16838"/>
-      <w:pgMar w:top="595" w:right="709" w:bottom="595" w:left="709" w:header="720" w:footer="720" w:gutter="0"/>
+      <w:pgMar w:top="539" w:right="652" w:bottom="510" w:left="652" w:header="720" w:footer="720" w:gutter="0"/>
       <w:cols w:space="720"/>
       <w:docGrid w:linePitch="360"/>
     </w:sectPr>
@@ -822,7 +860,7 @@
     <w:qFormat/>
     <w:rsid w:val="00FC693F"/>
     <w:pPr>
-      <w:spacing w:after="60"/>
+      <w:spacing w:after="40"/>
     </w:pPr>
     <w:rPr>
       <w:rFonts w:ascii="Noto Sans KR" w:hAnsi="Noto Sans KR" w:eastAsia="Noto Sans KR"/>

</xml_diff>